<commit_message>
Add SplitSchedule with scope toggle + calendar-initiated split flow
</commit_message>
<xml_diff>
--- a/Bill_Boss_Redesign_Spec.docx
+++ b/Bill_Boss_Redesign_Spec.docx
@@ -8307,6 +8307,1043 @@
           <w:szCs w:val="22"/>
         </w:rPr>
         <w:t xml:space="preserve"> again.</w:t>
+      </w:r>
+    </w:p>
+    <w:p>
+      <w:pPr>
+        <w:pStyle w:val="Heading1"/>
+        <w:spacing w:after="160" w:before="360"/>
+      </w:pPr>
+      <w:r>
+        <w:t xml:space="preserve">12. Addendum — Split Recurrence and Calendar-Initiated Splits</w:t>
+      </w:r>
+    </w:p>
+    <w:p>
+      <w:pPr>
+        <w:spacing w:after="120" w:before="0" w:line="300"/>
+        <w:jc w:val="left"/>
+      </w:pPr>
+      <w:r>
+        <w:rPr>
+          <w:b w:val="false"/>
+          <w:bCs w:val="false"/>
+          <w:i w:val="false"/>
+          <w:iCs w:val="false"/>
+          <w:sz w:val="22"/>
+          <w:szCs w:val="22"/>
+        </w:rPr>
+        <w:t xml:space="preserve">This section captures a refinement to the split-bill design in §4 and §6.3. It formalizes two user requirements: (a) a split must be explicitly marked as recurring or one-time so it does not silently carry over into the next cycle, and (b) users must be able to split any payment directly from the currently viewed month on the calendar, without having to first enable recurring splits on the underlying bill.</w:t>
+      </w:r>
+    </w:p>
+    <w:p>
+      <w:pPr>
+        <w:pStyle w:val="Heading2"/>
+        <w:spacing w:after="120" w:before="280"/>
+      </w:pPr>
+      <w:r>
+        <w:t xml:space="preserve">12.1 Confirmed bug in current behavior</w:t>
+      </w:r>
+    </w:p>
+    <w:p>
+      <w:pPr>
+        <w:spacing w:after="120" w:before="0" w:line="300"/>
+        <w:jc w:val="left"/>
+      </w:pPr>
+      <w:r>
+        <w:rPr>
+          <w:b w:val="false"/>
+          <w:bCs w:val="false"/>
+          <w:i w:val="false"/>
+          <w:iCs w:val="false"/>
+          <w:sz w:val="22"/>
+          <w:szCs w:val="22"/>
+        </w:rPr>
+        <w:t xml:space="preserve">Today, when a user splits a bill in Bill Boss and marks all portions as paid, the split schedule (stored in bill.alloc[]) is not cleared for the next cycle. The code keeps the alloc entries around so that paid history is preserved, but because alloc is also the source of truth for the render path, the same split portions reappear the following month. Root cause: the current model has no way to distinguish “split the April cycle only” from “split every cycle going forward,” so every split is implicitly treated as a recurring template.</w:t>
+      </w:r>
+    </w:p>
+    <w:p>
+      <w:pPr>
+        <w:spacing w:after="120" w:before="0" w:line="300"/>
+        <w:jc w:val="left"/>
+      </w:pPr>
+      <w:r>
+        <w:rPr>
+          <w:b/>
+          <w:bCs/>
+        </w:rPr>
+        <w:t xml:space="preserve">Consequence: </w:t>
+      </w:r>
+      <w:r>
+        <w:t xml:space="preserve">the user sees ghost split portions in May for a bill they intended to split only once in April, the Bill Boss calendar and dashboard calendar disagree on whether those portions are paid, and totals drift.</w:t>
+      </w:r>
+    </w:p>
+    <w:p>
+      <w:pPr>
+        <w:pStyle w:val="Heading2"/>
+        <w:spacing w:after="120" w:before="280"/>
+      </w:pPr>
+      <w:r>
+        <w:t xml:space="preserve">12.2 Data model change</w:t>
+      </w:r>
+    </w:p>
+    <w:p>
+      <w:pPr>
+        <w:spacing w:after="120" w:before="0" w:line="300"/>
+        <w:jc w:val="left"/>
+      </w:pPr>
+      <w:r>
+        <w:rPr>
+          <w:b w:val="false"/>
+          <w:bCs w:val="false"/>
+          <w:i w:val="false"/>
+          <w:iCs w:val="false"/>
+          <w:sz w:val="22"/>
+          <w:szCs w:val="22"/>
+        </w:rPr>
+        <w:t xml:space="preserve">Introduce a SplitSchedule record that owns the decision of whether a split applies once or every cycle. Child occurrences reference it:</w:t>
+      </w:r>
+    </w:p>
+    <w:p>
+      <w:pPr>
+        <w:shd w:fill="F4F4F4" w:val="clear"/>
+        <w:spacing w:after="0" w:line="260"/>
+      </w:pPr>
+      <w:r>
+        <w:rPr>
+          <w:rFonts w:ascii="Consolas" w:cs="Consolas" w:eastAsia="Consolas" w:hAnsi="Consolas"/>
+          <w:sz w:val="19"/>
+          <w:szCs w:val="19"/>
+        </w:rPr>
+        <w:t xml:space="preserve">export interface SplitSchedule {</w:t>
+      </w:r>
+    </w:p>
+    <w:p>
+      <w:pPr>
+        <w:shd w:fill="F4F4F4" w:val="clear"/>
+        <w:spacing w:after="0" w:line="260"/>
+      </w:pPr>
+      <w:r>
+        <w:rPr>
+          <w:rFonts w:ascii="Consolas" w:cs="Consolas" w:eastAsia="Consolas" w:hAnsi="Consolas"/>
+          <w:sz w:val="19"/>
+          <w:szCs w:val="19"/>
+        </w:rPr>
+        <w:t xml:space="preserve">  id: string;</w:t>
+      </w:r>
+    </w:p>
+    <w:p>
+      <w:pPr>
+        <w:shd w:fill="F4F4F4" w:val="clear"/>
+        <w:spacing w:after="0" w:line="260"/>
+      </w:pPr>
+      <w:r>
+        <w:rPr>
+          <w:rFonts w:ascii="Consolas" w:cs="Consolas" w:eastAsia="Consolas" w:hAnsi="Consolas"/>
+          <w:sz w:val="19"/>
+          <w:szCs w:val="19"/>
+        </w:rPr>
+        <w:t xml:space="preserve">  templateId: string;               // which bill is being split</w:t>
+      </w:r>
+    </w:p>
+    <w:p>
+      <w:pPr>
+        <w:shd w:fill="F4F4F4" w:val="clear"/>
+        <w:spacing w:after="0" w:line="260"/>
+      </w:pPr>
+      <w:r>
+        <w:rPr>
+          <w:rFonts w:ascii="Consolas" w:cs="Consolas" w:eastAsia="Consolas" w:hAnsi="Consolas"/>
+          <w:sz w:val="19"/>
+          <w:szCs w:val="19"/>
+        </w:rPr>
+        <w:t xml:space="preserve">  scope: 'one-time' | 'recurring';  // user’s explicit choice</w:t>
+      </w:r>
+    </w:p>
+    <w:p>
+      <w:pPr>
+        <w:shd w:fill="F4F4F4" w:val="clear"/>
+        <w:spacing w:after="0" w:line="260"/>
+      </w:pPr>
+      <w:r>
+        <w:rPr>
+          <w:rFonts w:ascii="Consolas" w:cs="Consolas" w:eastAsia="Consolas" w:hAnsi="Consolas"/>
+          <w:sz w:val="19"/>
+          <w:szCs w:val="19"/>
+        </w:rPr>
+        <w:t xml:space="preserve">  appliesToOccurrenceId?: string;   // required when scope === 'one-time'</w:t>
+      </w:r>
+    </w:p>
+    <w:p>
+      <w:pPr>
+        <w:shd w:fill="F4F4F4" w:val="clear"/>
+        <w:spacing w:after="0" w:line="260"/>
+      </w:pPr>
+      <w:r>
+        <w:rPr>
+          <w:rFonts w:ascii="Consolas" w:cs="Consolas" w:eastAsia="Consolas" w:hAnsi="Consolas"/>
+          <w:sz w:val="19"/>
+          <w:szCs w:val="19"/>
+        </w:rPr>
+        <w:t xml:space="preserve">  portions: SplitPortion[];         // N portions, each with amount + due offset</w:t>
+      </w:r>
+    </w:p>
+    <w:p>
+      <w:pPr>
+        <w:shd w:fill="F4F4F4" w:val="clear"/>
+        <w:spacing w:after="0" w:line="260"/>
+      </w:pPr>
+      <w:r>
+        <w:rPr>
+          <w:rFonts w:ascii="Consolas" w:cs="Consolas" w:eastAsia="Consolas" w:hAnsi="Consolas"/>
+          <w:sz w:val="19"/>
+          <w:szCs w:val="19"/>
+        </w:rPr>
+        <w:t xml:space="preserve">  createdAt: string;</w:t>
+      </w:r>
+    </w:p>
+    <w:p>
+      <w:pPr>
+        <w:shd w:fill="F4F4F4" w:val="clear"/>
+        <w:spacing w:after="0" w:line="260"/>
+      </w:pPr>
+      <w:r>
+        <w:rPr>
+          <w:rFonts w:ascii="Consolas" w:cs="Consolas" w:eastAsia="Consolas" w:hAnsi="Consolas"/>
+          <w:sz w:val="19"/>
+          <w:szCs w:val="19"/>
+        </w:rPr>
+        <w:t xml:space="preserve">}</w:t>
+      </w:r>
+    </w:p>
+    <w:p>
+      <w:pPr>
+        <w:shd w:fill="F4F4F4" w:val="clear"/>
+        <w:spacing w:after="0" w:line="260"/>
+      </w:pPr>
+      <w:r>
+        <w:rPr>
+          <w:rFonts w:ascii="Consolas" w:cs="Consolas" w:eastAsia="Consolas" w:hAnsi="Consolas"/>
+          <w:sz w:val="19"/>
+          <w:szCs w:val="19"/>
+        </w:rPr>
+        <w:t xml:space="preserve"> </w:t>
+      </w:r>
+    </w:p>
+    <w:p>
+      <w:pPr>
+        <w:shd w:fill="F4F4F4" w:val="clear"/>
+        <w:spacing w:after="0" w:line="260"/>
+      </w:pPr>
+      <w:r>
+        <w:rPr>
+          <w:rFonts w:ascii="Consolas" w:cs="Consolas" w:eastAsia="Consolas" w:hAnsi="Consolas"/>
+          <w:sz w:val="19"/>
+          <w:szCs w:val="19"/>
+        </w:rPr>
+        <w:t xml:space="preserve">export interface SplitPortion {</w:t>
+      </w:r>
+    </w:p>
+    <w:p>
+      <w:pPr>
+        <w:shd w:fill="F4F4F4" w:val="clear"/>
+        <w:spacing w:after="0" w:line="260"/>
+      </w:pPr>
+      <w:r>
+        <w:rPr>
+          <w:rFonts w:ascii="Consolas" w:cs="Consolas" w:eastAsia="Consolas" w:hAnsi="Consolas"/>
+          <w:sz w:val="19"/>
+          <w:szCs w:val="19"/>
+        </w:rPr>
+        <w:t xml:space="preserve">  index: number;</w:t>
+      </w:r>
+    </w:p>
+    <w:p>
+      <w:pPr>
+        <w:shd w:fill="F4F4F4" w:val="clear"/>
+        <w:spacing w:after="0" w:line="260"/>
+      </w:pPr>
+      <w:r>
+        <w:rPr>
+          <w:rFonts w:ascii="Consolas" w:cs="Consolas" w:eastAsia="Consolas" w:hAnsi="Consolas"/>
+          <w:sz w:val="19"/>
+          <w:szCs w:val="19"/>
+        </w:rPr>
+        <w:t xml:space="preserve">  amount: number;</w:t>
+      </w:r>
+    </w:p>
+    <w:p>
+      <w:pPr>
+        <w:shd w:fill="F4F4F4" w:val="clear"/>
+        <w:spacing w:after="0" w:line="260"/>
+      </w:pPr>
+      <w:r>
+        <w:rPr>
+          <w:rFonts w:ascii="Consolas" w:cs="Consolas" w:eastAsia="Consolas" w:hAnsi="Consolas"/>
+          <w:sz w:val="19"/>
+          <w:szCs w:val="19"/>
+        </w:rPr>
+        <w:t xml:space="preserve">  dueOffsetDays: number;            // from the cycle’s dueDate</w:t>
+      </w:r>
+    </w:p>
+    <w:p>
+      <w:pPr>
+        <w:shd w:fill="F4F4F4" w:val="clear"/>
+        <w:spacing w:after="0" w:line="260"/>
+      </w:pPr>
+      <w:r>
+        <w:rPr>
+          <w:rFonts w:ascii="Consolas" w:cs="Consolas" w:eastAsia="Consolas" w:hAnsi="Consolas"/>
+          <w:sz w:val="19"/>
+          <w:szCs w:val="19"/>
+        </w:rPr>
+        <w:t xml:space="preserve">  label?: string;</w:t>
+      </w:r>
+    </w:p>
+    <w:p>
+      <w:pPr>
+        <w:shd w:fill="F4F4F4" w:val="clear"/>
+        <w:spacing w:after="0" w:line="260"/>
+      </w:pPr>
+      <w:r>
+        <w:rPr>
+          <w:rFonts w:ascii="Consolas" w:cs="Consolas" w:eastAsia="Consolas" w:hAnsi="Consolas"/>
+          <w:sz w:val="19"/>
+          <w:szCs w:val="19"/>
+        </w:rPr>
+        <w:t xml:space="preserve">}</w:t>
+      </w:r>
+    </w:p>
+    <w:p>
+      <w:pPr>
+        <w:shd w:fill="F4F4F4" w:val="clear"/>
+        <w:spacing w:after="0" w:line="260"/>
+      </w:pPr>
+      <w:r>
+        <w:rPr>
+          <w:rFonts w:ascii="Consolas" w:cs="Consolas" w:eastAsia="Consolas" w:hAnsi="Consolas"/>
+          <w:sz w:val="19"/>
+          <w:szCs w:val="19"/>
+        </w:rPr>
+        <w:t xml:space="preserve"> </w:t>
+      </w:r>
+    </w:p>
+    <w:p>
+      <w:pPr>
+        <w:shd w:fill="F4F4F4" w:val="clear"/>
+        <w:spacing w:after="0" w:line="260"/>
+      </w:pPr>
+      <w:r>
+        <w:rPr>
+          <w:rFonts w:ascii="Consolas" w:cs="Consolas" w:eastAsia="Consolas" w:hAnsi="Consolas"/>
+          <w:sz w:val="19"/>
+          <w:szCs w:val="19"/>
+        </w:rPr>
+        <w:t xml:space="preserve">// BillOccurrence gains:</w:t>
+      </w:r>
+    </w:p>
+    <w:p>
+      <w:pPr>
+        <w:shd w:fill="F4F4F4" w:val="clear"/>
+        <w:spacing w:after="0" w:line="260"/>
+      </w:pPr>
+      <w:r>
+        <w:rPr>
+          <w:rFonts w:ascii="Consolas" w:cs="Consolas" w:eastAsia="Consolas" w:hAnsi="Consolas"/>
+          <w:sz w:val="19"/>
+          <w:szCs w:val="19"/>
+        </w:rPr>
+        <w:t xml:space="preserve">// splitScheduleId?: string</w:t>
+      </w:r>
+    </w:p>
+    <w:p>
+      <w:pPr>
+        <w:shd w:fill="F4F4F4" w:val="clear"/>
+        <w:spacing w:after="160" w:line="260"/>
+      </w:pPr>
+      <w:r>
+        <w:rPr>
+          <w:rFonts w:ascii="Consolas" w:cs="Consolas" w:eastAsia="Consolas" w:hAnsi="Consolas"/>
+          <w:sz w:val="19"/>
+          <w:szCs w:val="19"/>
+        </w:rPr>
+        <w:t xml:space="preserve">// splitOfOccurrenceId?: string  (already defined in §4.2)</w:t>
+      </w:r>
+    </w:p>
+    <w:p>
+      <w:pPr>
+        <w:spacing w:after="120" w:before="0" w:line="300"/>
+        <w:jc w:val="left"/>
+      </w:pPr>
+      <w:r>
+        <w:rPr>
+          <w:b/>
+          <w:bCs/>
+        </w:rPr>
+        <w:t xml:space="preserve">Interpretation: </w:t>
+      </w:r>
+      <w:r>
+        <w:t xml:space="preserve">a SplitSchedule with scope='one-time' materializes child occurrences for exactly one parent occurrence and is retired the moment that parent is fully paid. A SplitSchedule with scope='recurring' materializes child occurrences for every future parent cycle and is retired only when the user merges the split or archives the bill.</w:t>
+      </w:r>
+    </w:p>
+    <w:p>
+      <w:pPr>
+        <w:pStyle w:val="Heading2"/>
+        <w:spacing w:after="120" w:before="280"/>
+      </w:pPr>
+      <w:r>
+        <w:t xml:space="preserve">12.3 UX change — the split prompt</w:t>
+      </w:r>
+    </w:p>
+    <w:p>
+      <w:pPr>
+        <w:spacing w:after="120" w:before="0" w:line="300"/>
+        <w:jc w:val="left"/>
+      </w:pPr>
+      <w:r>
+        <w:rPr>
+          <w:b w:val="false"/>
+          <w:bCs w:val="false"/>
+          <w:i w:val="false"/>
+          <w:iCs w:val="false"/>
+          <w:sz w:val="22"/>
+          <w:szCs w:val="22"/>
+        </w:rPr>
+        <w:t xml:space="preserve">When the user taps Split on any bill occurrence, the sheet now opens with three required inputs instead of one:</w:t>
+      </w:r>
+    </w:p>
+    <w:p>
+      <w:pPr>
+        <w:pStyle w:val="ListParagraph"/>
+        <w:numPr>
+          <w:ilvl w:val="0"/>
+          <w:numId w:val="4"/>
+        </w:numPr>
+        <w:spacing w:after="80" w:line="280"/>
+      </w:pPr>
+      <w:r>
+        <w:rPr>
+          <w:sz w:val="22"/>
+          <w:szCs w:val="22"/>
+        </w:rPr>
+        <w:t xml:space="preserve">Number of portions (and amounts, if custom).</w:t>
+      </w:r>
+    </w:p>
+    <w:p>
+      <w:pPr>
+        <w:pStyle w:val="ListParagraph"/>
+        <w:numPr>
+          <w:ilvl w:val="0"/>
+          <w:numId w:val="4"/>
+        </w:numPr>
+        <w:spacing w:after="80" w:line="280"/>
+      </w:pPr>
+      <w:r>
+        <w:rPr>
+          <w:sz w:val="22"/>
+          <w:szCs w:val="22"/>
+        </w:rPr>
+        <w:t xml:space="preserve">Spacing — same-day, weekly, biweekly, or custom dates within the cycle.</w:t>
+      </w:r>
+    </w:p>
+    <w:p>
+      <w:pPr>
+        <w:pStyle w:val="ListParagraph"/>
+        <w:numPr>
+          <w:ilvl w:val="0"/>
+          <w:numId w:val="4"/>
+        </w:numPr>
+        <w:spacing w:after="80" w:line="280"/>
+      </w:pPr>
+      <w:r>
+        <w:rPr>
+          <w:b/>
+          <w:bCs/>
+        </w:rPr>
+        <w:t xml:space="preserve">Scope — </w:t>
+      </w:r>
+      <w:r>
+        <w:rPr>
+          <w:sz w:val="22"/>
+          <w:szCs w:val="22"/>
+        </w:rPr>
+        <w:t xml:space="preserve">a required toggle labeled “Apply this split to…” with two options: </w:t>
+      </w:r>
+      <w:r>
+        <w:rPr>
+          <w:i/>
+          <w:iCs/>
+          <w:sz w:val="22"/>
+          <w:szCs w:val="22"/>
+        </w:rPr>
+        <w:t xml:space="preserve">This month only</w:t>
+      </w:r>
+      <w:r>
+        <w:rPr>
+          <w:sz w:val="22"/>
+          <w:szCs w:val="22"/>
+        </w:rPr>
+        <w:t xml:space="preserve"> (default) or </w:t>
+      </w:r>
+      <w:r>
+        <w:rPr>
+          <w:i/>
+          <w:iCs/>
+          <w:sz w:val="22"/>
+          <w:szCs w:val="22"/>
+        </w:rPr>
+        <w:t xml:space="preserve">Every future cycle</w:t>
+      </w:r>
+      <w:r>
+        <w:rPr>
+          <w:sz w:val="22"/>
+          <w:szCs w:val="22"/>
+        </w:rPr>
+        <w:t xml:space="preserve">. The default is “This month only” to match the user’s expectation that a split is a one-off decision unless opted into recurrence.</w:t>
+      </w:r>
+    </w:p>
+    <w:p>
+      <w:pPr>
+        <w:spacing w:after="120" w:before="0" w:line="300"/>
+        <w:jc w:val="left"/>
+      </w:pPr>
+      <w:r>
+        <w:rPr>
+          <w:b w:val="false"/>
+          <w:bCs w:val="false"/>
+          <w:i w:val="false"/>
+          <w:iCs w:val="false"/>
+          <w:sz w:val="22"/>
+          <w:szCs w:val="22"/>
+        </w:rPr>
+        <w:t xml:space="preserve">The scope choice is persisted on the SplitSchedule, not on the individual occurrences. A user can later change scope via an Edit split action that prompts whether to extend an existing one-time split into all future cycles, or to collapse a recurring split into a single cycle.</w:t>
+      </w:r>
+    </w:p>
+    <w:p>
+      <w:pPr>
+        <w:pStyle w:val="Heading2"/>
+        <w:spacing w:after="120" w:before="280"/>
+      </w:pPr>
+      <w:r>
+        <w:t xml:space="preserve">12.4 UX change — calendar-initiated splits</w:t>
+      </w:r>
+    </w:p>
+    <w:p>
+      <w:pPr>
+        <w:spacing w:after="120" w:before="0" w:line="300"/>
+        <w:jc w:val="left"/>
+      </w:pPr>
+      <w:r>
+        <w:rPr>
+          <w:b w:val="false"/>
+          <w:bCs w:val="false"/>
+          <w:i w:val="false"/>
+          <w:iCs w:val="false"/>
+          <w:sz w:val="22"/>
+          <w:szCs w:val="22"/>
+        </w:rPr>
+        <w:t xml:space="preserve">Splitting must be available from the calendar itself, regardless of whether recurring splits are enabled on the underlying bill. The flow:</w:t>
+      </w:r>
+    </w:p>
+    <w:p>
+      <w:pPr>
+        <w:pStyle w:val="ListParagraph"/>
+        <w:numPr>
+          <w:ilvl w:val="0"/>
+          <w:numId w:val="5"/>
+        </w:numPr>
+        <w:spacing w:after="80" w:line="280"/>
+      </w:pPr>
+      <w:r>
+        <w:rPr>
+          <w:sz w:val="22"/>
+          <w:szCs w:val="22"/>
+        </w:rPr>
+        <w:t xml:space="preserve">User taps any day on the Bill Boss calendar or dashboard calendar that has a bill event.</w:t>
+      </w:r>
+    </w:p>
+    <w:p>
+      <w:pPr>
+        <w:pStyle w:val="ListParagraph"/>
+        <w:numPr>
+          <w:ilvl w:val="0"/>
+          <w:numId w:val="5"/>
+        </w:numPr>
+        <w:spacing w:after="80" w:line="280"/>
+      </w:pPr>
+      <w:r>
+        <w:rPr>
+          <w:sz w:val="22"/>
+          <w:szCs w:val="22"/>
+        </w:rPr>
+        <w:t xml:space="preserve">In the day-detail panel, each bill event gets a Split button.</w:t>
+      </w:r>
+    </w:p>
+    <w:p>
+      <w:pPr>
+        <w:pStyle w:val="ListParagraph"/>
+        <w:numPr>
+          <w:ilvl w:val="0"/>
+          <w:numId w:val="5"/>
+        </w:numPr>
+        <w:spacing w:after="80" w:line="280"/>
+      </w:pPr>
+      <w:r>
+        <w:rPr>
+          <w:sz w:val="22"/>
+          <w:szCs w:val="22"/>
+        </w:rPr>
+        <w:t xml:space="preserve">Tapping Split opens the same sheet described in §12.3, pre-scoped to the occurrence for that date. The Scope toggle still defaults to “This month only” — which is almost always the user’s intent when they’re acting on a specific calendar day.</w:t>
+      </w:r>
+    </w:p>
+    <w:p>
+      <w:pPr>
+        <w:pStyle w:val="ListParagraph"/>
+        <w:numPr>
+          <w:ilvl w:val="0"/>
+          <w:numId w:val="5"/>
+        </w:numPr>
+        <w:spacing w:after="80" w:line="280"/>
+      </w:pPr>
+      <w:r>
+        <w:rPr>
+          <w:sz w:val="22"/>
+          <w:szCs w:val="22"/>
+        </w:rPr>
+        <w:t xml:space="preserve">Confirming creates a SplitSchedule with scope='one-time' and appliesToOccurrenceId set to the tapped occurrence. The parent occurrence’s splitScheduleId is updated, child occurrences are materialized, and a bill.occurrence.split event fires.</w:t>
+      </w:r>
+    </w:p>
+    <w:p>
+      <w:pPr>
+        <w:spacing w:after="120" w:before="0" w:line="300"/>
+        <w:jc w:val="left"/>
+      </w:pPr>
+      <w:r>
+        <w:rPr>
+          <w:b/>
+          <w:bCs/>
+        </w:rPr>
+        <w:t xml:space="preserve">Why this matters: </w:t>
+      </w:r>
+      <w:r>
+        <w:t xml:space="preserve">this decouples the split UI from the bill’s recurrence settings. A user doesn’t have to enable “recurring split” on a bill to split one month’s payment — they just tap the day and split it. The recurring case is a deliberate upgrade (toggle scope to “Every future cycle”), never an accidental one.</w:t>
+      </w:r>
+    </w:p>
+    <w:p>
+      <w:pPr>
+        <w:pStyle w:val="Heading2"/>
+        <w:spacing w:after="120" w:before="280"/>
+      </w:pPr>
+      <w:r>
+        <w:t xml:space="preserve">12.5 Lifecycle — when does a one-time split retire?</w:t>
+      </w:r>
+    </w:p>
+    <w:p>
+      <w:pPr>
+        <w:pStyle w:val="ListParagraph"/>
+        <w:numPr>
+          <w:ilvl w:val="0"/>
+          <w:numId w:val="2"/>
+        </w:numPr>
+        <w:spacing w:after="80" w:line="280"/>
+      </w:pPr>
+      <w:r>
+        <w:rPr>
+          <w:sz w:val="22"/>
+          <w:szCs w:val="22"/>
+        </w:rPr>
+        <w:t xml:space="preserve">As soon as every child occurrence linked to that SplitSchedule reaches status='paid', the schedule is marked retired=true. No new child occurrences are materialized for any future cycle.</w:t>
+      </w:r>
+    </w:p>
+    <w:p>
+      <w:pPr>
+        <w:pStyle w:val="ListParagraph"/>
+        <w:numPr>
+          <w:ilvl w:val="0"/>
+          <w:numId w:val="2"/>
+        </w:numPr>
+        <w:spacing w:after="80" w:line="280"/>
+      </w:pPr>
+      <w:r>
+        <w:rPr>
+          <w:sz w:val="22"/>
+          <w:szCs w:val="22"/>
+        </w:rPr>
+        <w:t xml:space="preserve">The retired SplitSchedule and its paid child occurrences are kept for history (shown under the parent occurrence as “Split history for April 2026”).</w:t>
+      </w:r>
+    </w:p>
+    <w:p>
+      <w:pPr>
+        <w:pStyle w:val="ListParagraph"/>
+        <w:numPr>
+          <w:ilvl w:val="0"/>
+          <w:numId w:val="2"/>
+        </w:numPr>
+        <w:spacing w:after="80" w:line="280"/>
+      </w:pPr>
+      <w:r>
+        <w:rPr>
+          <w:sz w:val="22"/>
+          <w:szCs w:val="22"/>
+        </w:rPr>
+        <w:t xml:space="preserve">The NEXT cycle of the parent template materializes normally as a single occurrence — no ghost portions, no stale alloc entries, no calendar mismatch.</w:t>
+      </w:r>
+    </w:p>
+    <w:p>
+      <w:pPr>
+        <w:pStyle w:val="ListParagraph"/>
+        <w:numPr>
+          <w:ilvl w:val="0"/>
+          <w:numId w:val="2"/>
+        </w:numPr>
+        <w:spacing w:after="80" w:line="280"/>
+      </w:pPr>
+      <w:r>
+        <w:rPr>
+          <w:sz w:val="22"/>
+          <w:szCs w:val="22"/>
+        </w:rPr>
+        <w:t xml:space="preserve">If the user voids a payment on a retired one-time split’s child (via voidPayment), the schedule is reactivated and the child returns to ‘partial’ or ‘upcoming’ automatically.</w:t>
+      </w:r>
+    </w:p>
+    <w:p>
+      <w:pPr>
+        <w:pStyle w:val="Heading2"/>
+        <w:spacing w:after="120" w:before="280"/>
+      </w:pPr>
+      <w:r>
+        <w:t xml:space="preserve">12.6 Recurring splits — how they materialize</w:t>
+      </w:r>
+    </w:p>
+    <w:p>
+      <w:pPr>
+        <w:pStyle w:val="ListParagraph"/>
+        <w:numPr>
+          <w:ilvl w:val="0"/>
+          <w:numId w:val="2"/>
+        </w:numPr>
+        <w:spacing w:after="80" w:line="280"/>
+      </w:pPr>
+      <w:r>
+        <w:rPr>
+          <w:sz w:val="22"/>
+          <w:szCs w:val="22"/>
+        </w:rPr>
+        <w:t xml:space="preserve">When scope='recurring', the reconciler (§5.5) materializes child occurrences for every future parent cycle within the horizon. Each cycle’s child set has its own IDs — payments never bleed across cycles.</w:t>
+      </w:r>
+    </w:p>
+    <w:p>
+      <w:pPr>
+        <w:pStyle w:val="ListParagraph"/>
+        <w:numPr>
+          <w:ilvl w:val="0"/>
+          <w:numId w:val="2"/>
+        </w:numPr>
+        <w:spacing w:after="80" w:line="280"/>
+      </w:pPr>
+      <w:r>
+        <w:rPr>
+          <w:sz w:val="22"/>
+          <w:szCs w:val="22"/>
+        </w:rPr>
+        <w:t xml:space="preserve">Editing a recurring split (change amounts, add/remove a portion) prompts the standard “this cycle only / future cycles / all unpaid cycles” scope choice from §6.5.</w:t>
+      </w:r>
+    </w:p>
+    <w:p>
+      <w:pPr>
+        <w:pStyle w:val="ListParagraph"/>
+        <w:numPr>
+          <w:ilvl w:val="0"/>
+          <w:numId w:val="2"/>
+        </w:numPr>
+        <w:spacing w:after="80" w:line="280"/>
+      </w:pPr>
+      <w:r>
+        <w:rPr>
+          <w:sz w:val="22"/>
+          <w:szCs w:val="22"/>
+        </w:rPr>
+        <w:t xml:space="preserve">Archiving the parent template retires every SplitSchedule attached to it.</w:t>
+      </w:r>
+    </w:p>
+    <w:p>
+      <w:pPr>
+        <w:pStyle w:val="Heading2"/>
+        <w:spacing w:after="120" w:before="280"/>
+      </w:pPr>
+      <w:r>
+        <w:t xml:space="preserve">12.7 Calendar sync guarantees</w:t>
+      </w:r>
+    </w:p>
+    <w:p>
+      <w:pPr>
+        <w:spacing w:after="120" w:before="0" w:line="300"/>
+        <w:jc w:val="left"/>
+      </w:pPr>
+      <w:r>
+        <w:rPr>
+          <w:b w:val="false"/>
+          <w:bCs w:val="false"/>
+          <w:i w:val="false"/>
+          <w:iCs w:val="false"/>
+          <w:sz w:val="22"/>
+          <w:szCs w:val="22"/>
+        </w:rPr>
+        <w:t xml:space="preserve">Both calendars consume the same buildCalendarFeed (§5.4). A split action produces these feed changes atomically:</w:t>
+      </w:r>
+    </w:p>
+    <w:p>
+      <w:pPr>
+        <w:pStyle w:val="ListParagraph"/>
+        <w:numPr>
+          <w:ilvl w:val="0"/>
+          <w:numId w:val="2"/>
+        </w:numPr>
+        <w:spacing w:after="80" w:line="280"/>
+      </w:pPr>
+      <w:r>
+        <w:rPr>
+          <w:sz w:val="22"/>
+          <w:szCs w:val="22"/>
+        </w:rPr>
+        <w:t xml:space="preserve">The parent occurrence’s feed entry changes kind from 'bill' to 'bill' with splitChildIds populated (renders as a linked icon / expandable row).</w:t>
+      </w:r>
+    </w:p>
+    <w:p>
+      <w:pPr>
+        <w:pStyle w:val="ListParagraph"/>
+        <w:numPr>
+          <w:ilvl w:val="0"/>
+          <w:numId w:val="2"/>
+        </w:numPr>
+        <w:spacing w:after="80" w:line="280"/>
+      </w:pPr>
+      <w:r>
+        <w:rPr>
+          <w:sz w:val="22"/>
+          <w:szCs w:val="22"/>
+        </w:rPr>
+        <w:t xml:space="preserve">N new entries of kind='split-portion' appear with splitOf set to the parent’s occurrenceId.</w:t>
+      </w:r>
+    </w:p>
+    <w:p>
+      <w:pPr>
+        <w:pStyle w:val="ListParagraph"/>
+        <w:numPr>
+          <w:ilvl w:val="0"/>
+          <w:numId w:val="2"/>
+        </w:numPr>
+        <w:spacing w:after="80" w:line="280"/>
+      </w:pPr>
+      <w:r>
+        <w:rPr>
+          <w:sz w:val="22"/>
+          <w:szCs w:val="22"/>
+        </w:rPr>
+        <w:t xml:space="preserve">For one-time splits, the parent + child entries are scoped to that one month only. Navigating to the next month shows the parent template’s normal single occurrence again — no stale portions.</w:t>
+      </w:r>
+    </w:p>
+    <w:p>
+      <w:pPr>
+        <w:pStyle w:val="ListParagraph"/>
+        <w:numPr>
+          <w:ilvl w:val="0"/>
+          <w:numId w:val="2"/>
+        </w:numPr>
+        <w:spacing w:after="80" w:line="280"/>
+      </w:pPr>
+      <w:r>
+        <w:rPr>
+          <w:sz w:val="22"/>
+          <w:szCs w:val="22"/>
+        </w:rPr>
+        <w:t xml:space="preserve">For recurring splits, each future cycle’s feed entries include that cycle’s N portions, generated from the SplitSchedule and the cycle’s dueDate.</w:t>
+      </w:r>
+    </w:p>
+    <w:p>
+      <w:pPr>
+        <w:spacing w:after="120" w:before="0" w:line="300"/>
+        <w:jc w:val="left"/>
+      </w:pPr>
+      <w:r>
+        <w:rPr>
+          <w:b/>
+          <w:bCs/>
+        </w:rPr>
+        <w:t xml:space="preserve">Result: </w:t>
+      </w:r>
+      <w:r>
+        <w:t xml:space="preserve">the Bill Boss calendar and dashboard calendar can never disagree about whether a split exists in a given month. Both read from the same feed, and the SplitSchedule’s scope decides once — in one place — whether the portions exist in the month the user is looking at.</w:t>
+      </w:r>
+    </w:p>
+    <w:p>
+      <w:pPr>
+        <w:pStyle w:val="Heading2"/>
+        <w:spacing w:after="120" w:before="280"/>
+      </w:pPr>
+      <w:r>
+        <w:t xml:space="preserve">12.8 Migration notes for existing split bills</w:t>
+      </w:r>
+    </w:p>
+    <w:p>
+      <w:pPr>
+        <w:spacing w:after="120" w:before="0" w:line="300"/>
+        <w:jc w:val="left"/>
+      </w:pPr>
+      <w:r>
+        <w:rPr>
+          <w:b w:val="false"/>
+          <w:bCs w:val="false"/>
+          <w:i w:val="false"/>
+          <w:iCs w:val="false"/>
+          <w:sz w:val="22"/>
+          <w:szCs w:val="22"/>
+        </w:rPr>
+        <w:t xml:space="preserve">The migrator in §7.2 needs a small extension to classify each legacy split:</w:t>
+      </w:r>
+    </w:p>
+    <w:p>
+      <w:pPr>
+        <w:pStyle w:val="ListParagraph"/>
+        <w:numPr>
+          <w:ilvl w:val="0"/>
+          <w:numId w:val="2"/>
+        </w:numPr>
+        <w:spacing w:after="80" w:line="280"/>
+      </w:pPr>
+      <w:r>
+        <w:rPr>
+          <w:sz w:val="22"/>
+          <w:szCs w:val="22"/>
+        </w:rPr>
+        <w:t xml:space="preserve">If every alloc entry is paid AND the bill’s recurrence is monthly/weekly/custom → treat as a completed one-time split of the most recent cycle. Create a retired SplitSchedule, attach child occurrences for that cycle only.</w:t>
+      </w:r>
+    </w:p>
+    <w:p>
+      <w:pPr>
+        <w:pStyle w:val="ListParagraph"/>
+        <w:numPr>
+          <w:ilvl w:val="0"/>
+          <w:numId w:val="2"/>
+        </w:numPr>
+        <w:spacing w:after="80" w:line="280"/>
+      </w:pPr>
+      <w:r>
+        <w:rPr>
+          <w:sz w:val="22"/>
+          <w:szCs w:val="22"/>
+        </w:rPr>
+        <w:t xml:space="preserve">If some alloc entries are unpaid AND the alloc dates all fall within a single cycle window → treat as an active one-time split for that cycle.</w:t>
+      </w:r>
+    </w:p>
+    <w:p>
+      <w:pPr>
+        <w:pStyle w:val="ListParagraph"/>
+        <w:numPr>
+          <w:ilvl w:val="0"/>
+          <w:numId w:val="2"/>
+        </w:numPr>
+        <w:spacing w:after="80" w:line="280"/>
+      </w:pPr>
+      <w:r>
+        <w:rPr>
+          <w:sz w:val="22"/>
+          <w:szCs w:val="22"/>
+        </w:rPr>
+        <w:t xml:space="preserve">If alloc dates span multiple cycles (rare, but possible in the legacy model) → prompt the user on first open: “This split looks like it was meant to repeat. Convert to a recurring split?” Default to one-time if the user doesn’t respond within 30 days.</w:t>
+      </w:r>
+    </w:p>
+    <w:p>
+      <w:pPr>
+        <w:pStyle w:val="Heading2"/>
+        <w:spacing w:after="120" w:before="280"/>
+      </w:pPr>
+      <w:r>
+        <w:t xml:space="preserve">12.9 Test cases for this addendum</w:t>
+      </w:r>
+    </w:p>
+    <w:p>
+      <w:pPr>
+        <w:pStyle w:val="ListParagraph"/>
+        <w:numPr>
+          <w:ilvl w:val="0"/>
+          <w:numId w:val="2"/>
+        </w:numPr>
+        <w:spacing w:after="80" w:line="280"/>
+      </w:pPr>
+      <w:r>
+        <w:rPr>
+          <w:sz w:val="22"/>
+          <w:szCs w:val="22"/>
+        </w:rPr>
+        <w:t xml:space="preserve">Split a monthly bill in April with scope='one-time', pay all portions → May shows a single normal occurrence of the parent bill, no portions.</w:t>
+      </w:r>
+    </w:p>
+    <w:p>
+      <w:pPr>
+        <w:pStyle w:val="ListParagraph"/>
+        <w:numPr>
+          <w:ilvl w:val="0"/>
+          <w:numId w:val="2"/>
+        </w:numPr>
+        <w:spacing w:after="80" w:line="280"/>
+      </w:pPr>
+      <w:r>
+        <w:rPr>
+          <w:sz w:val="22"/>
+          <w:szCs w:val="22"/>
+        </w:rPr>
+        <w:t xml:space="preserve">Split a monthly bill in April with scope='recurring', pay April’s portions → May shows the same N portions, all unpaid, with their own fresh IDs.</w:t>
+      </w:r>
+    </w:p>
+    <w:p>
+      <w:pPr>
+        <w:pStyle w:val="ListParagraph"/>
+        <w:numPr>
+          <w:ilvl w:val="0"/>
+          <w:numId w:val="2"/>
+        </w:numPr>
+        <w:spacing w:after="80" w:line="280"/>
+      </w:pPr>
+      <w:r>
+        <w:rPr>
+          <w:sz w:val="22"/>
+          <w:szCs w:val="22"/>
+        </w:rPr>
+        <w:t xml:space="preserve">From the dashboard calendar, tap an April 15 rent event → Split → confirm with default scope='one-time' → Bill Boss calendar immediately shows the same portions on the same dates.</w:t>
+      </w:r>
+    </w:p>
+    <w:p>
+      <w:pPr>
+        <w:pStyle w:val="ListParagraph"/>
+        <w:numPr>
+          <w:ilvl w:val="0"/>
+          <w:numId w:val="2"/>
+        </w:numPr>
+        <w:spacing w:after="80" w:line="280"/>
+      </w:pPr>
+      <w:r>
+        <w:rPr>
+          <w:sz w:val="22"/>
+          <w:szCs w:val="22"/>
+        </w:rPr>
+        <w:t xml:space="preserve">Void one paid portion on a retired one-time split → schedule reactivates, parent occurrence drops back to 'partial' on both calendars.</w:t>
+      </w:r>
+    </w:p>
+    <w:p>
+      <w:pPr>
+        <w:pStyle w:val="ListParagraph"/>
+        <w:numPr>
+          <w:ilvl w:val="0"/>
+          <w:numId w:val="2"/>
+        </w:numPr>
+        <w:spacing w:after="80" w:line="280"/>
+      </w:pPr>
+      <w:r>
+        <w:rPr>
+          <w:sz w:val="22"/>
+          <w:szCs w:val="22"/>
+        </w:rPr>
+        <w:t xml:space="preserve">Edit a recurring split’s portion count from 4 to 3 with scope='future only' → April keeps 4 portions, May onward has 3.</w:t>
       </w:r>
     </w:p>
     <w:sectPr>
@@ -8584,6 +9621,30 @@
       </w:pPr>
     </w:lvl>
   </w:abstractNum>
+  <w:abstractNum w:abstractNumId="4" w15:restartNumberingAfterBreak="0">
+    <w:multiLevelType w:val="hybridMultilevel"/>
+    <w:lvl w:ilvl="0" w15:tentative="1">
+      <w:start w:val="1"/>
+      <w:numFmt w:val="decimal"/>
+      <w:lvlText w:val="%1."/>
+      <w:lvlJc w:val="left"/>
+      <w:pPr>
+        <w:ind w:left="720" w:hanging="360"/>
+      </w:pPr>
+    </w:lvl>
+  </w:abstractNum>
+  <w:abstractNum w:abstractNumId="5" w15:restartNumberingAfterBreak="0">
+    <w:multiLevelType w:val="hybridMultilevel"/>
+    <w:lvl w:ilvl="0" w15:tentative="1">
+      <w:start w:val="1"/>
+      <w:numFmt w:val="decimal"/>
+      <w:lvlText w:val="%1."/>
+      <w:lvlJc w:val="left"/>
+      <w:pPr>
+        <w:ind w:left="720" w:hanging="360"/>
+      </w:pPr>
+    </w:lvl>
+  </w:abstractNum>
   <w:num w:numId="1">
     <w:abstractNumId w:val="1"/>
     <w:lvlOverride w:ilvl="0">
@@ -8598,6 +9659,18 @@
   </w:num>
   <w:num w:numId="3">
     <w:abstractNumId w:val="3"/>
+    <w:lvlOverride w:ilvl="0">
+      <w:startOverride w:val="1"/>
+    </w:lvlOverride>
+  </w:num>
+  <w:num w:numId="4">
+    <w:abstractNumId w:val="4"/>
+    <w:lvlOverride w:ilvl="0">
+      <w:startOverride w:val="1"/>
+    </w:lvlOverride>
+  </w:num>
+  <w:num w:numId="5">
+    <w:abstractNumId w:val="5"/>
     <w:lvlOverride w:ilvl="0">
       <w:startOverride w:val="1"/>
     </w:lvlOverride>

</xml_diff>